<commit_message>
Bỏ model CV, bỏ file chess.js
</commit_message>
<xml_diff>
--- a/roadmap.docx
+++ b/roadmap.docx
@@ -266,6 +266,54 @@
       </w:pPr>
       <w:r>
         <w:t xml:space="preserve">Lưu lại bàn cờ </w:t>
+      </w:r>
+    </w:p>
+    <w:p/>
+    <w:p>
+      <w:r>
+        <w:rPr>
+          <w:highlight w:val="yellow"/>
+        </w:rPr>
+        <w:lastRenderedPageBreak/>
+        <w:t>Giai đoạn 5 : Tích hợp AI, tìm hiểu UI/UX</w:t>
+      </w:r>
+    </w:p>
+    <w:p>
+      <w:r>
+        <w:t xml:space="preserve">Khánh : </w:t>
+      </w:r>
+    </w:p>
+    <w:p>
+      <w:pPr>
+        <w:ind w:firstLine="720"/>
+      </w:pPr>
+      <w:r>
+        <w:t>-Tích hợp AI ( hint, PvE )</w:t>
+      </w:r>
+    </w:p>
+    <w:p>
+      <w:pPr>
+        <w:ind w:firstLine="720"/>
+      </w:pPr>
+      <w:r>
+        <w:t>- Làm phần gamePlay ( turn, bao giờ kết thúc game )</w:t>
+      </w:r>
+    </w:p>
+    <w:p>
+      <w:r>
+        <w:t>Hiếu :</w:t>
+      </w:r>
+    </w:p>
+    <w:p>
+      <w:pPr>
+        <w:pStyle w:val="oancuaDanhsach"/>
+        <w:numPr>
+          <w:ilvl w:val="0"/>
+          <w:numId w:val="3"/>
+        </w:numPr>
+      </w:pPr>
+      <w:r>
+        <w:t>Tìm hiểu UI/UX</w:t>
       </w:r>
     </w:p>
     <w:sectPr>

</xml_diff>

<commit_message>
Phân chia làm UI/UX
</commit_message>
<xml_diff>
--- a/roadmap.docx
+++ b/roadmap.docx
@@ -314,6 +314,66 @@
       </w:pPr>
       <w:r>
         <w:t>Tìm hiểu UI/UX</w:t>
+      </w:r>
+    </w:p>
+    <w:p/>
+    <w:p>
+      <w:r>
+        <w:t>Khánh :</w:t>
+      </w:r>
+    </w:p>
+    <w:p/>
+    <w:p>
+      <w:r>
+        <w:t>Hiếu :</w:t>
+      </w:r>
+    </w:p>
+    <w:p>
+      <w:pPr>
+        <w:pStyle w:val="oancuaDanhsach"/>
+        <w:numPr>
+          <w:ilvl w:val="0"/>
+          <w:numId w:val="3"/>
+        </w:numPr>
+      </w:pPr>
+      <w:r>
+        <w:t>Nút undo(), redo()</w:t>
+      </w:r>
+    </w:p>
+    <w:p>
+      <w:pPr>
+        <w:pStyle w:val="oancuaDanhsach"/>
+        <w:numPr>
+          <w:ilvl w:val="0"/>
+          <w:numId w:val="3"/>
+        </w:numPr>
+      </w:pPr>
+      <w:r>
+        <w:t>New game()</w:t>
+      </w:r>
+    </w:p>
+    <w:p>
+      <w:pPr>
+        <w:pStyle w:val="oancuaDanhsach"/>
+        <w:numPr>
+          <w:ilvl w:val="0"/>
+          <w:numId w:val="3"/>
+        </w:numPr>
+      </w:pPr>
+      <w:r>
+        <w:t xml:space="preserve">Đổi hình ảnh quân cờ </w:t>
+      </w:r>
+    </w:p>
+    <w:p>
+      <w:pPr>
+        <w:pStyle w:val="oancuaDanhsach"/>
+        <w:numPr>
+          <w:ilvl w:val="0"/>
+          <w:numId w:val="3"/>
+        </w:numPr>
+      </w:pPr>
+      <w:r>
+        <w:t xml:space="preserve">Đổi màu </w:t>
       </w:r>
     </w:p>
     <w:sectPr>

</xml_diff>

<commit_message>
chess.js : clearFen(), web -> node -> c++ ( vẫn còn lỗi )
</commit_message>
<xml_diff>
--- a/roadmap.docx
+++ b/roadmap.docx
@@ -267,6 +267,9 @@
       <w:r>
         <w:t xml:space="preserve">Lưu lại bàn cờ </w:t>
       </w:r>
+      <w:r>
+        <w:t xml:space="preserve"> </w:t>
+      </w:r>
     </w:p>
     <w:p/>
     <w:p>
@@ -320,6 +323,30 @@
     <w:p>
       <w:r>
         <w:t>Khánh :</w:t>
+      </w:r>
+    </w:p>
+    <w:p>
+      <w:pPr>
+        <w:pStyle w:val="oancuaDanhsach"/>
+        <w:numPr>
+          <w:ilvl w:val="0"/>
+          <w:numId w:val="3"/>
+        </w:numPr>
+      </w:pPr>
+      <w:r>
+        <w:t xml:space="preserve">Hiển thị bàn cờ, đưa quân cờ lên bàn cờ </w:t>
+      </w:r>
+    </w:p>
+    <w:p>
+      <w:pPr>
+        <w:pStyle w:val="oancuaDanhsach"/>
+        <w:numPr>
+          <w:ilvl w:val="0"/>
+          <w:numId w:val="3"/>
+        </w:numPr>
+      </w:pPr>
+      <w:r>
+        <w:t xml:space="preserve">Xử lí nút bấm ( cho quân cờ di chuyển đúng luật ), game turn </w:t>
       </w:r>
     </w:p>
     <w:p/>

</xml_diff>

<commit_message>
roadmap, save code phần hiển thị nước hợp lệ đi khi click vào quân cờ
</commit_message>
<xml_diff>
--- a/roadmap.docx
+++ b/roadmap.docx
@@ -349,12 +349,6 @@
         <w:t xml:space="preserve">Xử lí nút bấm ( cho quân cờ di chuyển đúng luật ), game turn </w:t>
       </w:r>
     </w:p>
-    <w:p/>
-    <w:p>
-      <w:r>
-        <w:t>Hiếu :</w:t>
-      </w:r>
-    </w:p>
     <w:p>
       <w:pPr>
         <w:pStyle w:val="oancuaDanhsach"/>
@@ -364,7 +358,13 @@
         </w:numPr>
       </w:pPr>
       <w:r>
-        <w:t>Nút undo(), redo()</w:t>
+        <w:t>Logic thắng thua hòa web</w:t>
+      </w:r>
+    </w:p>
+    <w:p/>
+    <w:p>
+      <w:r>
+        <w:t>Hiếu :</w:t>
       </w:r>
     </w:p>
     <w:p>
@@ -376,7 +376,7 @@
         </w:numPr>
       </w:pPr>
       <w:r>
-        <w:t>New game()</w:t>
+        <w:t>Nút undo(), redo()</w:t>
       </w:r>
     </w:p>
     <w:p>
@@ -388,7 +388,7 @@
         </w:numPr>
       </w:pPr>
       <w:r>
-        <w:t xml:space="preserve">Đổi hình ảnh quân cờ </w:t>
+        <w:t>New game()</w:t>
       </w:r>
     </w:p>
     <w:p>
@@ -400,7 +400,43 @@
         </w:numPr>
       </w:pPr>
       <w:r>
+        <w:t xml:space="preserve">Đổi hình ảnh quân cờ </w:t>
+      </w:r>
+    </w:p>
+    <w:p>
+      <w:pPr>
+        <w:pStyle w:val="oancuaDanhsach"/>
+        <w:numPr>
+          <w:ilvl w:val="0"/>
+          <w:numId w:val="3"/>
+        </w:numPr>
+      </w:pPr>
+      <w:r>
         <w:t xml:space="preserve">Đổi màu </w:t>
+      </w:r>
+    </w:p>
+    <w:p>
+      <w:pPr>
+        <w:pStyle w:val="oancuaDanhsach"/>
+        <w:numPr>
+          <w:ilvl w:val="0"/>
+          <w:numId w:val="3"/>
+        </w:numPr>
+      </w:pPr>
+      <w:r>
+        <w:t>Logic thời gian web</w:t>
+      </w:r>
+    </w:p>
+    <w:p>
+      <w:pPr>
+        <w:pStyle w:val="oancuaDanhsach"/>
+        <w:numPr>
+          <w:ilvl w:val="0"/>
+          <w:numId w:val="3"/>
+        </w:numPr>
+      </w:pPr>
+      <w:r>
+        <w:t>Hiển thị quân đã bị ăn</w:t>
       </w:r>
     </w:p>
     <w:sectPr>

</xml_diff>

<commit_message>
Fix Kiểm tra có thể thoát chiếu tướng không Can_Escape_Check
</commit_message>
<xml_diff>
--- a/roadmap.docx
+++ b/roadmap.docx
@@ -45,6 +45,11 @@
       </w:r>
     </w:p>
     <w:p>
+      <w:pPr>
+        <w:tabs>
+          <w:tab w:val="left" w:pos="5159"/>
+        </w:tabs>
+      </w:pPr>
       <w:r>
         <w:rPr>
           <w:b/>
@@ -58,6 +63,20 @@
           <w:bCs/>
         </w:rPr>
         <w:t xml:space="preserve"> :</w:t>
+      </w:r>
+      <w:r>
+        <w:rPr>
+          <w:b/>
+          <w:bCs/>
+        </w:rPr>
+        <w:t xml:space="preserve">  </w:t>
+      </w:r>
+      <w:r>
+        <w:rPr>
+          <w:b/>
+          <w:bCs/>
+        </w:rPr>
+        <w:tab/>
       </w:r>
     </w:p>
     <w:p>

</xml_diff>

<commit_message>
Duyệt cả 64 ô để lấy hiển thị nước đi ( chưa test )
</commit_message>
<xml_diff>
--- a/roadmap.docx
+++ b/roadmap.docx
@@ -378,6 +378,18 @@
       </w:pPr>
       <w:r>
         <w:t>Logic thắng thua hòa web</w:t>
+      </w:r>
+    </w:p>
+    <w:p>
+      <w:pPr>
+        <w:pStyle w:val="oancuaDanhsach"/>
+        <w:numPr>
+          <w:ilvl w:val="0"/>
+          <w:numId w:val="3"/>
+        </w:numPr>
+      </w:pPr>
+      <w:r>
+        <w:t>Hiển thị valid move</w:t>
       </w:r>
     </w:p>
     <w:p/>

</xml_diff>

<commit_message>
( UI ) Hoàn thành hiển thị nước đi hợp lệ cho quân cờ
</commit_message>
<xml_diff>
--- a/roadmap.docx
+++ b/roadmap.docx
@@ -390,6 +390,18 @@
       </w:pPr>
       <w:r>
         <w:t>Hiển thị valid move</w:t>
+      </w:r>
+    </w:p>
+    <w:p>
+      <w:pPr>
+        <w:pStyle w:val="oancuaDanhsach"/>
+        <w:numPr>
+          <w:ilvl w:val="0"/>
+          <w:numId w:val="3"/>
+        </w:numPr>
+      </w:pPr>
+      <w:r>
+        <w:t>Phong hậu</w:t>
       </w:r>
     </w:p>
     <w:p/>

</xml_diff>